<commit_message>
Update Projectplan Datalab V Herkansing.docx
</commit_message>
<xml_diff>
--- a/docs/Projectplan Datalab V Herkansing.docx
+++ b/docs/Projectplan Datalab V Herkansing.docx
@@ -109,7 +109,6 @@
                                   <w:dataBinding w:prefixMappings="xmlns:ns0='http://purl.org/dc/elements/1.1/' xmlns:ns1='http://schemas.openxmlformats.org/package/2006/metadata/core-properties' " w:xpath="/ns1:coreProperties[1]/ns0:subject[1]" w:storeItemID="{6C3C8BC8-F283-45AE-878A-BAB7291924A1}"/>
                                   <w:text/>
                                 </w:sdtPr>
-                                <w:sdtEndPr/>
                                 <w:sdtContent>
                                   <w:p>
                                     <w:pPr>
@@ -286,7 +285,6 @@
                             <w:dataBinding w:prefixMappings="xmlns:ns0='http://purl.org/dc/elements/1.1/' xmlns:ns1='http://schemas.openxmlformats.org/package/2006/metadata/core-properties' " w:xpath="/ns1:coreProperties[1]/ns0:subject[1]" w:storeItemID="{6C3C8BC8-F283-45AE-878A-BAB7291924A1}"/>
                             <w:text/>
                           </w:sdtPr>
-                          <w:sdtEndPr/>
                           <w:sdtContent>
                             <w:p>
                               <w:pPr>
@@ -602,7 +600,6 @@
                                       <w:dataBinding w:prefixMappings="xmlns:ns0='http://purl.org/dc/elements/1.1/' xmlns:ns1='http://schemas.openxmlformats.org/package/2006/metadata/core-properties' " w:xpath="/ns1:coreProperties[1]/ns0:title[1]" w:storeItemID="{6C3C8BC8-F283-45AE-878A-BAB7291924A1}"/>
                                       <w:text/>
                                     </w:sdtPr>
-                                    <w:sdtEndPr/>
                                     <w:sdtContent>
                                       <w:r>
                                         <w:rPr>
@@ -773,7 +770,6 @@
                                 <w:dataBinding w:prefixMappings="xmlns:ns0='http://purl.org/dc/elements/1.1/' xmlns:ns1='http://schemas.openxmlformats.org/package/2006/metadata/core-properties' " w:xpath="/ns1:coreProperties[1]/ns0:title[1]" w:storeItemID="{6C3C8BC8-F283-45AE-878A-BAB7291924A1}"/>
                                 <w:text/>
                               </w:sdtPr>
-                              <w:sdtEndPr/>
                               <w:sdtContent>
                                 <w:r>
                                   <w:rPr>
@@ -884,7 +880,6 @@
                                     <w:calendar w:val="gregorian"/>
                                   </w:date>
                                 </w:sdtPr>
-                                <w:sdtEndPr/>
                                 <w:sdtContent>
                                   <w:p>
                                     <w:pPr>
@@ -951,7 +946,6 @@
                               <w:calendar w:val="gregorian"/>
                             </w:date>
                           </w:sdtPr>
-                          <w:sdtEndPr/>
                           <w:sdtContent>
                             <w:p>
                               <w:pPr>
@@ -1026,7 +1020,6 @@
           <w:docPartUnique/>
         </w:docPartObj>
       </w:sdtPr>
-      <w:sdtEndPr/>
       <w:sdtContent>
         <w:p>
           <w:pPr>
@@ -3010,7 +3003,7 @@
           <w:sz w:val="22"/>
           <w:szCs w:val="22"/>
         </w:rPr>
-        <w:tab/>
+        <w:t xml:space="preserve">. </w:t>
       </w:r>
     </w:p>
     <w:p>
@@ -17793,19 +17786,6 @@
 </file>
 
 <file path=customXml/item3.xml><?xml version="1.0" encoding="utf-8"?>
-<?mso-contentType ?>
-<FormTemplates xmlns="http://schemas.microsoft.com/sharepoint/v3/contenttype/forms">
-  <Display>DocumentLibraryForm</Display>
-  <Edit>DocumentLibraryForm</Edit>
-  <New>DocumentLibraryForm</New>
-</FormTemplates>
-</file>
-
-<file path=customXml/item4.xml><?xml version="1.0" encoding="utf-8"?>
-<b:Sources xmlns:b="http://schemas.openxmlformats.org/officeDocument/2006/bibliography" xmlns="http://schemas.openxmlformats.org/officeDocument/2006/bibliography" SelectedStyle="\APASixthEditionOfficeOnline.xsl" StyleName="APA" Version="6"/>
-</file>
-
-<file path=customXml/item5.xml><?xml version="1.0" encoding="utf-8"?>
 <ct:contentTypeSchema xmlns:ct="http://schemas.microsoft.com/office/2006/metadata/contentType" xmlns:ma="http://schemas.microsoft.com/office/2006/metadata/properties/metaAttributes" ct:_="" ma:_="" ma:contentTypeName="Document" ma:contentTypeID="0x0101005FB30423456C604282169674456AABEF" ma:contentTypeVersion="14" ma:contentTypeDescription="Een nieuw document maken." ma:contentTypeScope="" ma:versionID="88429a035aba3b3803f9b4071920fe9e">
   <xsd:schema xmlns:xsd="http://www.w3.org/2001/XMLSchema" xmlns:xs="http://www.w3.org/2001/XMLSchema" xmlns:p="http://schemas.microsoft.com/office/2006/metadata/properties" xmlns:ns3="55c2aa68-1191-43f2-b545-56784840ed66" xmlns:ns4="ae803f8a-fd1e-4606-8385-1ff405e76ecc" targetNamespace="http://schemas.microsoft.com/office/2006/metadata/properties" ma:root="true" ma:fieldsID="854dab537a12af7d0079e5825a3b8732" ns3:_="" ns4:_="">
     <xsd:import namespace="55c2aa68-1191-43f2-b545-56784840ed66"/>
@@ -18032,6 +18012,19 @@
 </ct:contentTypeSchema>
 </file>
 
+<file path=customXml/item4.xml><?xml version="1.0" encoding="utf-8"?>
+<b:Sources xmlns:b="http://schemas.openxmlformats.org/officeDocument/2006/bibliography" xmlns="http://schemas.openxmlformats.org/officeDocument/2006/bibliography" SelectedStyle="\APASixthEditionOfficeOnline.xsl" StyleName="APA" Version="6"/>
+</file>
+
+<file path=customXml/item5.xml><?xml version="1.0" encoding="utf-8"?>
+<?mso-contentType ?>
+<FormTemplates xmlns="http://schemas.microsoft.com/sharepoint/v3/contenttype/forms">
+  <Display>DocumentLibraryForm</Display>
+  <Edit>DocumentLibraryForm</Edit>
+  <New>DocumentLibraryForm</New>
+</FormTemplates>
+</file>
+
 <file path=customXml/itemProps1.xml><?xml version="1.0" encoding="utf-8"?>
 <ds:datastoreItem xmlns:ds="http://schemas.openxmlformats.org/officeDocument/2006/customXml" ds:itemID="{55AF091B-3C7A-41E3-B477-F2FDAA23CFDA}">
   <ds:schemaRefs>
@@ -18051,22 +18044,6 @@
 </file>
 
 <file path=customXml/itemProps3.xml><?xml version="1.0" encoding="utf-8"?>
-<ds:datastoreItem xmlns:ds="http://schemas.openxmlformats.org/officeDocument/2006/customXml" ds:itemID="{B147BCC7-9957-4036-88D2-C5E598B6EACF}">
-  <ds:schemaRefs>
-    <ds:schemaRef ds:uri="http://schemas.microsoft.com/sharepoint/v3/contenttype/forms"/>
-  </ds:schemaRefs>
-</ds:datastoreItem>
-</file>
-
-<file path=customXml/itemProps4.xml><?xml version="1.0" encoding="utf-8"?>
-<ds:datastoreItem xmlns:ds="http://schemas.openxmlformats.org/officeDocument/2006/customXml" ds:itemID="{C50AD3A3-9010-4BE2-A5E4-80A706D9E719}">
-  <ds:schemaRefs>
-    <ds:schemaRef ds:uri="http://schemas.openxmlformats.org/officeDocument/2006/bibliography"/>
-  </ds:schemaRefs>
-</ds:datastoreItem>
-</file>
-
-<file path=customXml/itemProps5.xml><?xml version="1.0" encoding="utf-8"?>
 <ds:datastoreItem xmlns:ds="http://schemas.openxmlformats.org/officeDocument/2006/customXml" ds:itemID="{2EF77B87-1CC9-48BB-BF79-34D5D86F10AA}">
   <ds:schemaRefs>
     <ds:schemaRef ds:uri="http://schemas.microsoft.com/office/2006/metadata/contentType"/>
@@ -18083,4 +18060,20 @@
     <ds:schemaRef ds:uri="http://schemas.microsoft.com/internal/obd"/>
   </ds:schemaRefs>
 </ds:datastoreItem>
+</file>
+
+<file path=customXml/itemProps4.xml><?xml version="1.0" encoding="utf-8"?>
+<ds:datastoreItem xmlns:ds="http://schemas.openxmlformats.org/officeDocument/2006/customXml" ds:itemID="{C50AD3A3-9010-4BE2-A5E4-80A706D9E719}">
+  <ds:schemaRefs>
+    <ds:schemaRef ds:uri="http://schemas.openxmlformats.org/officeDocument/2006/bibliography"/>
+  </ds:schemaRefs>
+</ds:datastoreItem>
+</file>
+
+<file path=customXml/itemProps5.xml><?xml version="1.0" encoding="utf-8"?>
+<ds:datastoreItem xmlns:ds="http://schemas.openxmlformats.org/officeDocument/2006/customXml" ds:itemID="{B147BCC7-9957-4036-88D2-C5E598B6EACF}">
+  <ds:schemaRefs>
+    <ds:schemaRef ds:uri="http://schemas.microsoft.com/sharepoint/v3/contenttype/forms"/>
+  </ds:schemaRefs>
+</ds:datastoreItem>
 </file>
</xml_diff>